<commit_message>
Protocolmanuscript BMJ Open: steekproef en power zelf nagerekend (65 per arm, 130; power 85%, gesimuleerd 83%; mediator 52 per arm), adherentiegroepen en blindering volgens FWO-dossier, KD voorgesteld als guarantor, statisticus-opmerkingen afgehandeld
Co-Authored-By: Claude Opus 5.5 <noreply@anthropic.com>
</commit_message>
<xml_diff>
--- a/protocol paper/BMJ Open/Indienen_BMJOpen.docx
+++ b/protocol paper/BMJ Open/Indienen_BMJOpen.docx
@@ -41,7 +41,7 @@
           <w:color w:val="5A6A78"/>
           <w:sz w:val="17"/>
         </w:rPr>
-        <w:t>Stand 19 oktober 2026. Alle bestanden staan in deze map; wat nog ontbreekt, staat in deel 2. Artikeltype in ScholarOne: Protocol. Woordentelling hoofdtekst: 6860.</w:t>
+        <w:t>Stand 19 oktober 2026. Alle bestanden staan in deze map; wat nog ontbreekt, staat in deel 2. Artikeltype in ScholarOne: Protocol. Woordentelling hoofdtekst: 6990.</w:t>
       </w:r>
     </w:p>
     <w:p>
@@ -990,7 +990,7 @@
                 <w:i w:val="0"/>
                 <w:sz w:val="17"/>
               </w:rPr>
-              <w:t>Guarantor kiezen</w:t>
+              <w:t>Guarantor bevestigen; in de tekst staat Kevin Deschamps (PI) als voorstel</w:t>
             </w:r>
           </w:p>
         </w:tc>
@@ -1008,7 +1008,7 @@
                 <w:i w:val="0"/>
                 <w:sz w:val="17"/>
               </w:rPr>
-              <w:t>Auteurs</w:t>
+              <w:t>Kevin Deschamps</w:t>
             </w:r>
           </w:p>
         </w:tc>
@@ -1138,7 +1138,7 @@
                 <w:i w:val="0"/>
                 <w:sz w:val="17"/>
               </w:rPr>
-              <w:t>Subgroep gezondheidsgeletterdheid, mediatiemethode, adherentie-interval maand 9–12</w:t>
+              <w:t>Steekproef en analysekeuzes zijn nagerekend en onderbouwd (19/10); het SAP uitschrijven vóór database lock</w:t>
             </w:r>
           </w:p>
         </w:tc>
@@ -1156,7 +1156,7 @@
                 <w:i w:val="0"/>
                 <w:sz w:val="17"/>
               </w:rPr>
-              <w:t>Statisticus</w:t>
+              <w:t>Janou</w:t>
             </w:r>
           </w:p>
         </w:tc>
@@ -1174,7 +1174,7 @@
                 <w:i w:val="0"/>
                 <w:sz w:val="17"/>
               </w:rPr>
-              <w:t>Opmerkingen; SAP</w:t>
+              <w:t>SAP</w:t>
             </w:r>
           </w:p>
         </w:tc>

</xml_diff>

<commit_message>
MoveMonitor mee op visite 1, terug op visite 2 (teambeslissing 26/10): voorstel V2 uit de BMJ Open-versie teruggezet (tekst, tabel 1, figuren 2 en 4, opmerking, indienlijst); site, BRONNEN en CLAUDE.md expliciet; test op V1/V2
Co-Authored-By: Claude Opus 5.5 <noreply@anthropic.com>
</commit_message>
<xml_diff>
--- a/protocol paper/BMJ Open/Indienen_BMJOpen.docx
+++ b/protocol paper/BMJ Open/Indienen_BMJOpen.docx
@@ -41,7 +41,7 @@
           <w:color w:val="5A6A78"/>
           <w:sz w:val="17"/>
         </w:rPr>
-        <w:t>Stand 19 oktober 2026. Alle bestanden staan in deze map; wat nog ontbreekt, staat in deel 2. Artikeltype in ScholarOne: Protocol. Woordentelling hoofdtekst: 6990.</w:t>
+        <w:t>Stand 26 oktober 2026. Alle bestanden staan in deze map; wat nog ontbreekt, staat in deel 2. Artikeltype in ScholarOne: Protocol. Woordentelling hoofdtekst: 6994.</w:t>
       </w:r>
     </w:p>
     <w:p>
@@ -1064,80 +1064,6 @@
                 <w:i w:val="0"/>
                 <w:sz w:val="17"/>
               </w:rPr>
-              <w:t>MoveMonitor op V2 bevestigen; anders tekst, tabel 1 en figuren 2 en 4 terugzetten</w:t>
-            </w:r>
-          </w:p>
-        </w:tc>
-        <w:tc>
-          <w:tcPr>
-            <w:tcW w:type="dxa" w:w="1587"/>
-          </w:tcPr>
-          <w:p>
-            <w:pPr>
-              <w:spacing w:after="20"/>
-            </w:pPr>
-            <w:r>
-              <w:rPr>
-                <w:b w:val="0"/>
-                <w:i w:val="0"/>
-                <w:sz w:val="17"/>
-              </w:rPr>
-              <w:t>PI</w:t>
-            </w:r>
-          </w:p>
-        </w:tc>
-        <w:tc>
-          <w:tcPr>
-            <w:tcW w:type="dxa" w:w="2778"/>
-          </w:tcPr>
-          <w:p>
-            <w:pPr>
-              <w:spacing w:after="20"/>
-            </w:pPr>
-            <w:r>
-              <w:rPr>
-                <w:b w:val="0"/>
-                <w:i w:val="0"/>
-                <w:sz w:val="17"/>
-              </w:rPr>
-              <w:t>Opmerking in de tekst</w:t>
-            </w:r>
-          </w:p>
-        </w:tc>
-      </w:tr>
-      <w:tr>
-        <w:tc>
-          <w:tcPr>
-            <w:tcW w:type="dxa" w:w="397"/>
-          </w:tcPr>
-          <w:p>
-            <w:pPr>
-              <w:spacing w:after="20"/>
-            </w:pPr>
-            <w:r>
-              <w:rPr>
-                <w:b w:val="0"/>
-                <w:i w:val="0"/>
-                <w:sz w:val="17"/>
-              </w:rPr>
-              <w:t>5</w:t>
-            </w:r>
-          </w:p>
-        </w:tc>
-        <w:tc>
-          <w:tcPr>
-            <w:tcW w:type="dxa" w:w="5102"/>
-          </w:tcPr>
-          <w:p>
-            <w:pPr>
-              <w:spacing w:after="20"/>
-            </w:pPr>
-            <w:r>
-              <w:rPr>
-                <w:b w:val="0"/>
-                <w:i w:val="0"/>
-                <w:sz w:val="17"/>
-              </w:rPr>
               <w:t>Steekproef en analysekeuzes zijn nagerekend en onderbouwd (19/10); het SAP uitschrijven vóór database lock</w:t>
             </w:r>
           </w:p>
@@ -1194,7 +1120,7 @@
                 <w:i w:val="0"/>
                 <w:sz w:val="17"/>
               </w:rPr>
-              <w:t>6</w:t>
+              <w:t>5</w:t>
             </w:r>
           </w:p>
         </w:tc>
@@ -1268,7 +1194,7 @@
                 <w:i w:val="0"/>
                 <w:sz w:val="17"/>
               </w:rPr>
-              <w:t>7</w:t>
+              <w:t>6</w:t>
             </w:r>
           </w:p>
         </w:tc>
@@ -1342,7 +1268,7 @@
                 <w:i w:val="0"/>
                 <w:sz w:val="17"/>
               </w:rPr>
-              <w:t>8</w:t>
+              <w:t>7</w:t>
             </w:r>
           </w:p>
         </w:tc>
@@ -1416,7 +1342,7 @@
                 <w:i w:val="0"/>
                 <w:sz w:val="17"/>
               </w:rPr>
-              <w:t>9</w:t>
+              <w:t>8</w:t>
             </w:r>
           </w:p>
         </w:tc>
@@ -1490,7 +1416,7 @@
                 <w:i w:val="0"/>
                 <w:sz w:val="17"/>
               </w:rPr>
-              <w:t>10</w:t>
+              <w:t>9</w:t>
             </w:r>
           </w:p>
         </w:tc>
@@ -1617,7 +1543,7 @@
           <w:b w:val="0"/>
           <w:i w:val="0"/>
         </w:rPr>
-        <w:t>De Trials-versie van het manuscript blijft de master met bijgehouden wijzigingen; de BMJ Open-versie is een aparte, schone versie en loopt vanaf nu inhoudelijk uiteen (onder meer MoveMonitor op V2 en de nieuwe tabellen).</w:t>
+        <w:t>De Trials-versie van het manuscript blijft de master met bijgehouden wijzigingen; de BMJ Open-versie is een aparte, schone versie en loopt vanaf nu inhoudelijk uiteen (onder meer de nieuwe tabellen).</w:t>
       </w:r>
     </w:p>
     <w:p>

</xml_diff>